<commit_message>
CoreDocs guide: real screenshots + tips matched to live screens
- Replace all 10 placeholder screenshots with real captures of the live
  pages (dashboard, batches, reviews, transmittals, documents, mddr,
  reporting, admin import/users/vendors).
- Add review-detail.png as a second image on the Reviews section
  (Review Chain + outcome codes A1/B1/B2/C1/D1/Q1/V1/S1).
- Refine registry.ts + build_user_guide.py tips against the real UI:
  Smart Search on Document Search; SDDR/CDDL/MDDR combined register with
  Sync Progress / Upload / Export CSV; the 5 named reports incl. P6
  Activity-ID export; the SharePoint auto-sync + CSV Dry/Full/Incremental
  import; Users roles; Vendors & Packages awarded badges.
- Regenerate CoreDocs-User-Guide.docx with the real images.

Co-Authored-By: Claude Opus 4.8 (1M context) <noreply@anthropic.com>
</commit_message>
<xml_diff>
--- a/CoreDocs-User-Guide.docx
+++ b/CoreDocs-User-Guide.docx
@@ -125,7 +125,7 @@
       <w:r>
         <w:drawing>
           <wp:inline xmlns:a="http://schemas.openxmlformats.org/drawingml/2006/main" xmlns:pic="http://schemas.openxmlformats.org/drawingml/2006/picture">
-            <wp:extent cx="5669280" cy="3188970"/>
+            <wp:extent cx="5669280" cy="3045652"/>
             <wp:docPr id="1" name="Picture 1"/>
             <wp:cNvGraphicFramePr>
               <a:graphicFrameLocks noChangeAspect="1"/>
@@ -146,7 +146,7 @@
                   <pic:spPr>
                     <a:xfrm>
                       <a:off x="0" y="0"/>
-                      <a:ext cx="5669280" cy="3188970"/>
+                      <a:ext cx="5669280" cy="3045652"/>
                     </a:xfrm>
                     <a:prstGeom prst="rect"/>
                   </pic:spPr>
@@ -222,7 +222,7 @@
       <w:r>
         <w:drawing>
           <wp:inline xmlns:a="http://schemas.openxmlformats.org/drawingml/2006/main" xmlns:pic="http://schemas.openxmlformats.org/drawingml/2006/picture">
-            <wp:extent cx="5669280" cy="3188970"/>
+            <wp:extent cx="5669280" cy="3045652"/>
             <wp:docPr id="2" name="Picture 2"/>
             <wp:cNvGraphicFramePr>
               <a:graphicFrameLocks noChangeAspect="1"/>
@@ -243,7 +243,7 @@
                   <pic:spPr>
                     <a:xfrm>
                       <a:off x="0" y="0"/>
-                      <a:ext cx="5669280" cy="3188970"/>
+                      <a:ext cx="5669280" cy="3045652"/>
                     </a:xfrm>
                     <a:prstGeom prst="rect"/>
                   </pic:spPr>
@@ -301,7 +301,7 @@
     </w:p>
     <w:p>
       <w:r>
-        <w:t>The documents assigned to you to review, and where you record your review outcome.</w:t>
+        <w:t>The documents assigned to you to review, and where you record your review outcome. The list is split into Pending / In Progress and Completed, with an overdue banner so nothing slips.</w:t>
       </w:r>
     </w:p>
     <w:p>
@@ -311,7 +311,7 @@
       <w:r>
         <w:drawing>
           <wp:inline xmlns:a="http://schemas.openxmlformats.org/drawingml/2006/main" xmlns:pic="http://schemas.openxmlformats.org/drawingml/2006/picture">
-            <wp:extent cx="5669280" cy="3188970"/>
+            <wp:extent cx="5669280" cy="3045652"/>
             <wp:docPr id="3" name="Picture 3"/>
             <wp:cNvGraphicFramePr>
               <a:graphicFrameLocks noChangeAspect="1"/>
@@ -332,7 +332,7 @@
                   <pic:spPr>
                     <a:xfrm>
                       <a:off x="0" y="0"/>
-                      <a:ext cx="5669280" cy="3188970"/>
+                      <a:ext cx="5669280" cy="3045652"/>
                     </a:xfrm>
                     <a:prstGeom prst="rect"/>
                   </pic:spPr>
@@ -358,10 +358,54 @@
     </w:p>
     <w:p>
       <w:pPr>
-        <w:pStyle w:val="ListBullet"/>
+        <w:jc w:val="center"/>
       </w:pPr>
       <w:r>
-        <w:t>Open a document to view it (and any markups), then set your status - e.g. approved, approved-with-comments, or rejected/returned.</w:t>
+        <w:drawing>
+          <wp:inline xmlns:a="http://schemas.openxmlformats.org/drawingml/2006/main" xmlns:pic="http://schemas.openxmlformats.org/drawingml/2006/picture">
+            <wp:extent cx="5669280" cy="3045652"/>
+            <wp:docPr id="4" name="Picture 4"/>
+            <wp:cNvGraphicFramePr>
+              <a:graphicFrameLocks noChangeAspect="1"/>
+            </wp:cNvGraphicFramePr>
+            <a:graphic>
+              <a:graphicData uri="http://schemas.openxmlformats.org/drawingml/2006/picture">
+                <pic:pic>
+                  <pic:nvPicPr>
+                    <pic:cNvPr id="0" name="review-detail.png"/>
+                    <pic:cNvPicPr/>
+                  </pic:nvPicPr>
+                  <pic:blipFill>
+                    <a:blip r:embed="rId12"/>
+                    <a:stretch>
+                      <a:fillRect/>
+                    </a:stretch>
+                  </pic:blipFill>
+                  <pic:spPr>
+                    <a:xfrm>
+                      <a:off x="0" y="0"/>
+                      <a:ext cx="5669280" cy="3045652"/>
+                    </a:xfrm>
+                    <a:prstGeom prst="rect"/>
+                  </pic:spPr>
+                </pic:pic>
+              </a:graphicData>
+            </a:graphic>
+          </wp:inline>
+        </w:drawing>
+      </w:r>
+    </w:p>
+    <w:p>
+      <w:pPr>
+        <w:jc w:val="center"/>
+      </w:pPr>
+      <w:r>
+        <w:rPr>
+          <w:i/>
+          <w:color w:val="808080"/>
+          <w:sz w:val="18"/>
+        </w:rPr>
+        <w:t>Screen: My Reviews - review detail (Review Chain &amp; outcome codes)</w:t>
       </w:r>
     </w:p>
     <w:p>
@@ -369,7 +413,7 @@
         <w:pStyle w:val="ListBullet"/>
       </w:pPr>
       <w:r>
-        <w:t>Add review comments; these flow back to the Document Controller and onto the transmittal.</w:t>
+        <w:t>Work the top of the list first - anything flagged overdue holds up the whole document cycle. Open a document to view it (and any markups) in the Review Chain.</w:t>
       </w:r>
     </w:p>
     <w:p>
@@ -377,7 +421,15 @@
         <w:pStyle w:val="ListBullet"/>
       </w:pPr>
       <w:r>
-        <w:t>Clear your list before the due date - overdue reviews hold up the whole document cycle.</w:t>
+        <w:t>Record a formal outcome code: A1 (approved), B1/B2 (approved with comments), C1 / D1 (revise &amp; resubmit), Q1 (for quotation), V1 / S1 (information / superseded). Add your comments alongside the code.</w:t>
+      </w:r>
+    </w:p>
+    <w:p>
+      <w:pPr>
+        <w:pStyle w:val="ListBullet"/>
+      </w:pPr>
+      <w:r>
+        <w:t>Your outcome and comments flow back to the Document Controller and onto the transmittal - once set, the document moves to Completed.</w:t>
       </w:r>
     </w:p>
     <w:p>
@@ -390,7 +442,7 @@
     </w:p>
     <w:p>
       <w:r>
-        <w:t>Formal issue and receipt of documents - the auditable record of what was sent to whom, when, and why.</w:t>
+        <w:t>The Transmittal Register - formal issue and receipt of documents, the auditable record of what was sent to whom, when, and why.</w:t>
       </w:r>
     </w:p>
     <w:p>
@@ -400,8 +452,8 @@
       <w:r>
         <w:drawing>
           <wp:inline xmlns:a="http://schemas.openxmlformats.org/drawingml/2006/main" xmlns:pic="http://schemas.openxmlformats.org/drawingml/2006/picture">
-            <wp:extent cx="5669280" cy="3188970"/>
-            <wp:docPr id="4" name="Picture 4"/>
+            <wp:extent cx="5669280" cy="3045652"/>
+            <wp:docPr id="5" name="Picture 5"/>
             <wp:cNvGraphicFramePr>
               <a:graphicFrameLocks noChangeAspect="1"/>
             </wp:cNvGraphicFramePr>
@@ -413,7 +465,7 @@
                     <pic:cNvPicPr/>
                   </pic:nvPicPr>
                   <pic:blipFill>
-                    <a:blip r:embed="rId12"/>
+                    <a:blip r:embed="rId13"/>
                     <a:stretch>
                       <a:fillRect/>
                     </a:stretch>
@@ -421,7 +473,7 @@
                   <pic:spPr>
                     <a:xfrm>
                       <a:off x="0" y="0"/>
-                      <a:ext cx="5669280" cy="3188970"/>
+                      <a:ext cx="5669280" cy="3045652"/>
                     </a:xfrm>
                     <a:prstGeom prst="rect"/>
                   </pic:spPr>
@@ -487,7 +539,7 @@
     </w:p>
     <w:p>
       <w:r>
-        <w:t>Search the master document register - find any deliverable by number, title, discipline, status or revision.</w:t>
+        <w:t>Search the full document register (3,500+ documents) - find any deliverable by number, title, package, vendor or status.</w:t>
       </w:r>
     </w:p>
     <w:p>
@@ -497,8 +549,8 @@
       <w:r>
         <w:drawing>
           <wp:inline xmlns:a="http://schemas.openxmlformats.org/drawingml/2006/main" xmlns:pic="http://schemas.openxmlformats.org/drawingml/2006/picture">
-            <wp:extent cx="5669280" cy="3188970"/>
-            <wp:docPr id="5" name="Picture 5"/>
+            <wp:extent cx="5669280" cy="3045652"/>
+            <wp:docPr id="6" name="Picture 6"/>
             <wp:cNvGraphicFramePr>
               <a:graphicFrameLocks noChangeAspect="1"/>
             </wp:cNvGraphicFramePr>
@@ -510,7 +562,7 @@
                     <pic:cNvPicPr/>
                   </pic:nvPicPr>
                   <pic:blipFill>
-                    <a:blip r:embed="rId13"/>
+                    <a:blip r:embed="rId14"/>
                     <a:stretch>
                       <a:fillRect/>
                     </a:stretch>
@@ -518,7 +570,7 @@
                   <pic:spPr>
                     <a:xfrm>
                       <a:off x="0" y="0"/>
-                      <a:ext cx="5669280" cy="3188970"/>
+                      <a:ext cx="5669280" cy="3045652"/>
                     </a:xfrm>
                     <a:prstGeom prst="rect"/>
                   </pic:spPr>
@@ -547,7 +599,7 @@
         <w:pStyle w:val="ListBullet"/>
       </w:pPr>
       <w:r>
-        <w:t>Type a document number or title; use the filters (discipline, status, vendor, revision) to narrow the list.</w:t>
+        <w:t>Use Smart Search to describe the document in plain language ('the HV single-line diagram for the substation') - it matches on meaning, not just exact text.</w:t>
       </w:r>
     </w:p>
     <w:p>
@@ -555,7 +607,7 @@
         <w:pStyle w:val="ListBullet"/>
       </w:pPr>
       <w:r>
-        <w:t>Open a document to see its full history - every revision, review and transmittal it has been through.</w:t>
+        <w:t>Narrow the list with the Package / Vendor / Source / Sector filters and the Awarded / Unawarded toggle.</w:t>
       </w:r>
     </w:p>
     <w:p>
@@ -563,7 +615,7 @@
         <w:pStyle w:val="ListBullet"/>
       </w:pPr>
       <w:r>
-        <w:t>This is the quickest way to answer 'what's the latest revision / status of X?'.</w:t>
+        <w:t>Open a document to see its full history - every revision, review and transmittal it has been through. This is the quickest way to answer 'what's the latest revision / status of X?'.</w:t>
       </w:r>
     </w:p>
     <w:p>
@@ -576,7 +628,7 @@
     </w:p>
     <w:p>
       <w:r>
-        <w:t>The Master Deliverables &amp; Document Register - the controlled master list of every deliverable, its planned dates, current revision and status.</w:t>
+        <w:t>The Master Document &amp; Drawing Register - the controlled master list combining the SDDR, CDDL and MDDR into one register of every deliverable (6,000+ entries) with its current revision, status and progress.</w:t>
       </w:r>
     </w:p>
     <w:p>
@@ -586,8 +638,8 @@
       <w:r>
         <w:drawing>
           <wp:inline xmlns:a="http://schemas.openxmlformats.org/drawingml/2006/main" xmlns:pic="http://schemas.openxmlformats.org/drawingml/2006/picture">
-            <wp:extent cx="5669280" cy="3188970"/>
-            <wp:docPr id="6" name="Picture 6"/>
+            <wp:extent cx="5669280" cy="3045652"/>
+            <wp:docPr id="7" name="Picture 7"/>
             <wp:cNvGraphicFramePr>
               <a:graphicFrameLocks noChangeAspect="1"/>
             </wp:cNvGraphicFramePr>
@@ -599,7 +651,7 @@
                     <pic:cNvPicPr/>
                   </pic:nvPicPr>
                   <pic:blipFill>
-                    <a:blip r:embed="rId14"/>
+                    <a:blip r:embed="rId15"/>
                     <a:stretch>
                       <a:fillRect/>
                     </a:stretch>
@@ -607,7 +659,7 @@
                   <pic:spPr>
                     <a:xfrm>
                       <a:off x="0" y="0"/>
-                      <a:ext cx="5669280" cy="3188970"/>
+                      <a:ext cx="5669280" cy="3045652"/>
                     </a:xfrm>
                     <a:prstGeom prst="rect"/>
                   </pic:spPr>
@@ -636,7 +688,7 @@
         <w:pStyle w:val="ListBullet"/>
       </w:pPr>
       <w:r>
-        <w:t>Each row is a deliverable with its document number, title, discipline, planned vs actual dates and current status/revision.</w:t>
+        <w:t>Each row is a deliverable with its document number, title, package/discipline, current revision and status. Use Columns to choose what's shown.</w:t>
       </w:r>
     </w:p>
     <w:p>
@@ -644,7 +696,7 @@
         <w:pStyle w:val="ListBullet"/>
       </w:pPr>
       <w:r>
-        <w:t>Filter by package / vendor / discipline / status to focus on a slice of the register.</w:t>
+        <w:t>Run Sync Progress to refresh deliverable progress from the latest data; use Upload Register to bulk-load or update entries, and Export CSV for an offline copy or the client return.</w:t>
       </w:r>
     </w:p>
     <w:p>
@@ -652,7 +704,7 @@
         <w:pStyle w:val="ListBullet"/>
       </w:pPr>
       <w:r>
-        <w:t>This is the single source of truth for deliverable progress - it drives the reporting and the client returns.</w:t>
+        <w:t>This is the single source of truth for deliverable progress - it drives the Reporting dashboards.</w:t>
       </w:r>
     </w:p>
     <w:p>
@@ -665,7 +717,7 @@
     </w:p>
     <w:p>
       <w:r>
-        <w:t>Progress and status reports built from the live register - for the project team and the client.</w:t>
+        <w:t>Progress and status reports built live from the register - for the project team and the client.</w:t>
       </w:r>
     </w:p>
     <w:p>
@@ -675,8 +727,8 @@
       <w:r>
         <w:drawing>
           <wp:inline xmlns:a="http://schemas.openxmlformats.org/drawingml/2006/main" xmlns:pic="http://schemas.openxmlformats.org/drawingml/2006/picture">
-            <wp:extent cx="5669280" cy="3188970"/>
-            <wp:docPr id="7" name="Picture 7"/>
+            <wp:extent cx="5669280" cy="3045652"/>
+            <wp:docPr id="8" name="Picture 8"/>
             <wp:cNvGraphicFramePr>
               <a:graphicFrameLocks noChangeAspect="1"/>
             </wp:cNvGraphicFramePr>
@@ -688,7 +740,7 @@
                     <pic:cNvPicPr/>
                   </pic:nvPicPr>
                   <pic:blipFill>
-                    <a:blip r:embed="rId15"/>
+                    <a:blip r:embed="rId16"/>
                     <a:stretch>
                       <a:fillRect/>
                     </a:stretch>
@@ -696,7 +748,7 @@
                   <pic:spPr>
                     <a:xfrm>
                       <a:off x="0" y="0"/>
-                      <a:ext cx="5669280" cy="3188970"/>
+                      <a:ext cx="5669280" cy="3045652"/>
                     </a:xfrm>
                     <a:prstGeom prst="rect"/>
                   </pic:spPr>
@@ -725,7 +777,7 @@
         <w:pStyle w:val="ListBullet"/>
       </w:pPr>
       <w:r>
-        <w:t>Status / progress reports summarise the register by discipline, vendor or package.</w:t>
+        <w:t>The reports are: Progress Dashboard (overall % complete), Engineering Tracker, Package Progress Summary, PPE Phase 1 Engineering Deliverables, and the P6 Activity-ID Progress Export.</w:t>
       </w:r>
     </w:p>
     <w:p>
@@ -733,7 +785,7 @@
         <w:pStyle w:val="ListBullet"/>
       </w:pPr>
       <w:r>
-        <w:t>Use these for the document-control return and to spot bottlenecks (overdue reviews, ageing batches).</w:t>
+        <w:t>Use the P6 Activity-ID export to feed deliverable progress straight back into the Primavera P6 schedule.</w:t>
       </w:r>
     </w:p>
     <w:p>
@@ -741,7 +793,7 @@
         <w:pStyle w:val="ListBullet"/>
       </w:pPr>
       <w:r>
-        <w:t>Reports read live from the MDDR, so they are always current - no manual spreadsheet upkeep.</w:t>
+        <w:t>Everything reads live from the MDDR, so the numbers are always current - no manual spreadsheet upkeep.</w:t>
       </w:r>
     </w:p>
     <w:p>
@@ -762,7 +814,7 @@
     </w:p>
     <w:p>
       <w:r>
-        <w:t>Bring documents and metadata in - bulk import of the document index and the SharePoint / Aconex sync (admin only).</w:t>
+        <w:t>Bring SharePoint data into CoreDocs - the automatic SharePoint sync and a manual CSV import (admin only). Always run a dry run first to preview before committing.</w:t>
       </w:r>
     </w:p>
     <w:p>
@@ -772,8 +824,8 @@
       <w:r>
         <w:drawing>
           <wp:inline xmlns:a="http://schemas.openxmlformats.org/drawingml/2006/main" xmlns:pic="http://schemas.openxmlformats.org/drawingml/2006/picture">
-            <wp:extent cx="5669280" cy="3188970"/>
-            <wp:docPr id="8" name="Picture 8"/>
+            <wp:extent cx="5669280" cy="3045652"/>
+            <wp:docPr id="9" name="Picture 9"/>
             <wp:cNvGraphicFramePr>
               <a:graphicFrameLocks noChangeAspect="1"/>
             </wp:cNvGraphicFramePr>
@@ -785,7 +837,7 @@
                     <pic:cNvPicPr/>
                   </pic:nvPicPr>
                   <pic:blipFill>
-                    <a:blip r:embed="rId16"/>
+                    <a:blip r:embed="rId17"/>
                     <a:stretch>
                       <a:fillRect/>
                     </a:stretch>
@@ -793,7 +845,7 @@
                   <pic:spPr>
                     <a:xfrm>
                       <a:off x="0" y="0"/>
-                      <a:ext cx="5669280" cy="3188970"/>
+                      <a:ext cx="5669280" cy="3045652"/>
                     </a:xfrm>
                     <a:prstGeom prst="rect"/>
                   </pic:spPr>
@@ -822,7 +874,7 @@
         <w:pStyle w:val="ListBullet"/>
       </w:pPr>
       <w:r>
-        <w:t>Import a document-index spreadsheet to seed or update the register in bulk.</w:t>
+        <w:t>Automatic SharePoint Sync pulls the Approver Picks and Document Approval lists straight from SharePoint via Microsoft Graph (no CSV needed) - it runs every day at 02:00 UTC. Use 'Sync now (force update)' to refresh immediately, 'Sync changes only' for just the deltas, or 'Preview (dry run)' to see what would change.</w:t>
       </w:r>
     </w:p>
     <w:p>
@@ -830,7 +882,7 @@
         <w:pStyle w:val="ListBullet"/>
       </w:pPr>
       <w:r>
-        <w:t>Run the SharePoint sync to pull the latest files/metadata into CoreDocs.</w:t>
+        <w:t>To import from a CSV instead: pick the Import Source (e.g. Approver Picks - Batch records), choose a mode - Dry Run (validate only), Full (insert/update all) or Incremental (new records only) - then upload the CSV.</w:t>
       </w:r>
     </w:p>
     <w:p>
@@ -838,7 +890,7 @@
         <w:pStyle w:val="ListBullet"/>
       </w:pPr>
       <w:r>
-        <w:t>Imports are designed to be safe to re-run; check the result summary after each run.</w:t>
+        <w:t>Always start with a Dry Run: it validates and shows what would happen without changing anything. Re-running imports is safe; check the result summary after each run.</w:t>
       </w:r>
     </w:p>
     <w:p>
@@ -851,7 +903,7 @@
     </w:p>
     <w:p>
       <w:r>
-        <w:t>Manage who can access CoreDocs and what they can do - user accounts and roles (admin only).</w:t>
+        <w:t>Manage who can access the Document Control platform - user accounts and roles (admin only).</w:t>
       </w:r>
     </w:p>
     <w:p>
@@ -861,8 +913,8 @@
       <w:r>
         <w:drawing>
           <wp:inline xmlns:a="http://schemas.openxmlformats.org/drawingml/2006/main" xmlns:pic="http://schemas.openxmlformats.org/drawingml/2006/picture">
-            <wp:extent cx="5669280" cy="3188970"/>
-            <wp:docPr id="9" name="Picture 9"/>
+            <wp:extent cx="5669280" cy="3045652"/>
+            <wp:docPr id="10" name="Picture 10"/>
             <wp:cNvGraphicFramePr>
               <a:graphicFrameLocks noChangeAspect="1"/>
             </wp:cNvGraphicFramePr>
@@ -874,7 +926,7 @@
                     <pic:cNvPicPr/>
                   </pic:nvPicPr>
                   <pic:blipFill>
-                    <a:blip r:embed="rId17"/>
+                    <a:blip r:embed="rId18"/>
                     <a:stretch>
                       <a:fillRect/>
                     </a:stretch>
@@ -882,7 +934,7 @@
                   <pic:spPr>
                     <a:xfrm>
                       <a:off x="0" y="0"/>
-                      <a:ext cx="5669280" cy="3188970"/>
+                      <a:ext cx="5669280" cy="3045652"/>
                     </a:xfrm>
                     <a:prstGeom prst="rect"/>
                   </pic:spPr>
@@ -911,7 +963,7 @@
         <w:pStyle w:val="ListBullet"/>
       </w:pPr>
       <w:r>
-        <w:t>Each user has a role that controls their menu and permissions: Document Controller, Reviewer, Engineering/Project Manager, Vendor or Admin.</w:t>
+        <w:t>Each user has a role that controls their menu and permissions: Admin, Reviewer, Document Controller, Engineering/Project Manager or Vendor. The badge next to each name shows their current role.</w:t>
       </w:r>
     </w:p>
     <w:p>
@@ -919,7 +971,7 @@
         <w:pStyle w:val="ListBullet"/>
       </w:pPr>
       <w:r>
-        <w:t>Set a person's role here; it takes effect on their next page load.</w:t>
+        <w:t>Use 'Add User' to invite someone, or 'Edit' to change a person's role - it takes effect on their next page load.</w:t>
       </w:r>
     </w:p>
     <w:p>
@@ -927,7 +979,7 @@
         <w:pStyle w:val="ListBullet"/>
       </w:pPr>
       <w:r>
-        <w:t>Keep the reviewer list current so batches can be assigned to the right people.</w:t>
+        <w:t>Keep the reviewer list current so incoming batches can be assigned to the right people.</w:t>
       </w:r>
     </w:p>
     <w:p>
@@ -940,7 +992,7 @@
     </w:p>
     <w:p>
       <w:r>
-        <w:t>The vendors and work packages that documents belong to (admin only).</w:t>
+        <w:t>The project packages and the vendor each is awarded to (admin only). PPE's own engineering scope sits under package K124.</w:t>
       </w:r>
     </w:p>
     <w:p>
@@ -950,8 +1002,8 @@
       <w:r>
         <w:drawing>
           <wp:inline xmlns:a="http://schemas.openxmlformats.org/drawingml/2006/main" xmlns:pic="http://schemas.openxmlformats.org/drawingml/2006/picture">
-            <wp:extent cx="5669280" cy="3188970"/>
-            <wp:docPr id="10" name="Picture 10"/>
+            <wp:extent cx="5669280" cy="3045652"/>
+            <wp:docPr id="11" name="Picture 11"/>
             <wp:cNvGraphicFramePr>
               <a:graphicFrameLocks noChangeAspect="1"/>
             </wp:cNvGraphicFramePr>
@@ -963,7 +1015,7 @@
                     <pic:cNvPicPr/>
                   </pic:nvPicPr>
                   <pic:blipFill>
-                    <a:blip r:embed="rId18"/>
+                    <a:blip r:embed="rId19"/>
                     <a:stretch>
                       <a:fillRect/>
                     </a:stretch>
@@ -971,7 +1023,7 @@
                   <pic:spPr>
                     <a:xfrm>
                       <a:off x="0" y="0"/>
-                      <a:ext cx="5669280" cy="3188970"/>
+                      <a:ext cx="5669280" cy="3045652"/>
                     </a:xfrm>
                     <a:prstGeom prst="rect"/>
                   </pic:spPr>
@@ -1000,7 +1052,7 @@
         <w:pStyle w:val="ListBullet"/>
       </w:pPr>
       <w:r>
-        <w:t>Maintain the list of vendors and the packages/disciplines they deliver against.</w:t>
+        <w:t>Each row is a package (e.g. E101 - 36MVA High Speed Diesel Generator) with an 'Awarded: &lt;vendor&gt;' badge, or 'Not awarded yet' if the contract isn't placed.</w:t>
       </w:r>
     </w:p>
     <w:p>
@@ -1008,7 +1060,7 @@
         <w:pStyle w:val="ListBullet"/>
       </w:pPr>
       <w:r>
-        <w:t>Correct vendor/package setup is what lets batches, the register and reporting group documents properly.</w:t>
+        <w:t>Set the awarded vendor as packages are placed - this is what lets batches, the register and reporting group documents by package and vendor correctly.</w:t>
       </w:r>
     </w:p>
     <w:p/>

</xml_diff>